<commit_message>
cambios: cancelacion de eventos actualizacion de eventos
</commit_message>
<xml_diff>
--- a/TP Final - Programación III - Plataforma de Eventos de Networking Empresarial_copia.docx
+++ b/TP Final - Programación III - Plataforma de Eventos de Networking Empresarial_copia.docx
@@ -42,25 +42,7 @@
           <w:szCs w:val="28"/>
           <w:lang w:val="es-AR"/>
         </w:rPr>
-        <w:t xml:space="preserve">Plataforma de Eventos de </w:t>
-      </w:r>
-      <w:proofErr w:type="spellStart"/>
-      <w:r>
-        <w:rPr>
-          <w:sz w:val="28"/>
-          <w:szCs w:val="28"/>
-          <w:lang w:val="es-AR"/>
-        </w:rPr>
-        <w:t>Networking</w:t>
-      </w:r>
-      <w:proofErr w:type="spellEnd"/>
-      <w:r>
-        <w:rPr>
-          <w:sz w:val="28"/>
-          <w:szCs w:val="28"/>
-          <w:lang w:val="es-AR"/>
-        </w:rPr>
-        <w:t xml:space="preserve"> Empresarial</w:t>
+        <w:t>Plataforma de Eventos de Networking Empresarial</w:t>
       </w:r>
     </w:p>
     <w:p>
@@ -70,27 +52,9 @@
       </w:pPr>
       <w:bookmarkStart w:id="1" w:name="_heading=h.30j0zll" w:colFirst="0" w:colLast="0"/>
       <w:bookmarkEnd w:id="1"/>
-      <w:proofErr w:type="spellStart"/>
-      <w:r>
-        <w:t>Condiciones</w:t>
-      </w:r>
-      <w:proofErr w:type="spellEnd"/>
-      <w:r>
-        <w:t xml:space="preserve"> </w:t>
-      </w:r>
-      <w:proofErr w:type="spellStart"/>
-      <w:r>
-        <w:t>generales</w:t>
-      </w:r>
-      <w:proofErr w:type="spellEnd"/>
-      <w:r>
-        <w:t xml:space="preserve"> para la </w:t>
-      </w:r>
-      <w:proofErr w:type="spellStart"/>
-      <w:r>
-        <w:t>realización</w:t>
-      </w:r>
-      <w:proofErr w:type="spellEnd"/>
+      <w:r>
+        <w:t>Condiciones generales para la realización</w:t>
+      </w:r>
     </w:p>
     <w:p/>
     <w:p>
@@ -158,23 +122,7 @@
           <w:sz w:val="24"/>
           <w:szCs w:val="24"/>
         </w:rPr>
-        <w:t xml:space="preserve">MongoDB (base de </w:t>
-      </w:r>
-      <w:proofErr w:type="spellStart"/>
-      <w:r>
-        <w:rPr>
-          <w:sz w:val="24"/>
-          <w:szCs w:val="24"/>
-        </w:rPr>
-        <w:t>datos</w:t>
-      </w:r>
-      <w:proofErr w:type="spellEnd"/>
-      <w:r>
-        <w:rPr>
-          <w:sz w:val="24"/>
-          <w:szCs w:val="24"/>
-        </w:rPr>
-        <w:t>)</w:t>
+        <w:t>MongoDB (base de datos)</w:t>
       </w:r>
     </w:p>
     <w:p>
@@ -196,23 +144,7 @@
           <w:sz w:val="24"/>
           <w:szCs w:val="24"/>
         </w:rPr>
-        <w:t>Express.js (</w:t>
-      </w:r>
-      <w:proofErr w:type="spellStart"/>
-      <w:r>
-        <w:rPr>
-          <w:sz w:val="24"/>
-          <w:szCs w:val="24"/>
-        </w:rPr>
-        <w:t>routeo</w:t>
-      </w:r>
-      <w:proofErr w:type="spellEnd"/>
-      <w:r>
-        <w:rPr>
-          <w:sz w:val="24"/>
-          <w:szCs w:val="24"/>
-        </w:rPr>
-        <w:t>)</w:t>
+        <w:t>Express.js (routeo)</w:t>
       </w:r>
     </w:p>
     <w:p>
@@ -234,23 +166,7 @@
           <w:sz w:val="24"/>
           <w:szCs w:val="24"/>
         </w:rPr>
-        <w:t>React.js / React Native (</w:t>
-      </w:r>
-      <w:proofErr w:type="spellStart"/>
-      <w:r>
-        <w:rPr>
-          <w:sz w:val="24"/>
-          <w:szCs w:val="24"/>
-        </w:rPr>
-        <w:t>FrontEnd</w:t>
-      </w:r>
-      <w:proofErr w:type="spellEnd"/>
-      <w:r>
-        <w:rPr>
-          <w:sz w:val="24"/>
-          <w:szCs w:val="24"/>
-        </w:rPr>
-        <w:t>)</w:t>
+        <w:t>React.js / React Native (FrontEnd)</w:t>
       </w:r>
     </w:p>
     <w:p>
@@ -272,23 +188,7 @@
           <w:sz w:val="24"/>
           <w:szCs w:val="24"/>
         </w:rPr>
-        <w:t>Node.js (</w:t>
-      </w:r>
-      <w:proofErr w:type="spellStart"/>
-      <w:r>
-        <w:rPr>
-          <w:sz w:val="24"/>
-          <w:szCs w:val="24"/>
-        </w:rPr>
-        <w:t>BackEnd</w:t>
-      </w:r>
-      <w:proofErr w:type="spellEnd"/>
-      <w:r>
-        <w:rPr>
-          <w:sz w:val="24"/>
-          <w:szCs w:val="24"/>
-        </w:rPr>
-        <w:t>)</w:t>
+        <w:t>Node.js (BackEnd)</w:t>
       </w:r>
     </w:p>
     <w:p>
@@ -334,43 +234,7 @@
           <w:szCs w:val="24"/>
           <w:lang w:val="es-AR"/>
         </w:rPr>
-        <w:t xml:space="preserve">Librerías de UI: </w:t>
-      </w:r>
-      <w:proofErr w:type="spellStart"/>
-      <w:r>
-        <w:rPr>
-          <w:sz w:val="24"/>
-          <w:szCs w:val="24"/>
-          <w:lang w:val="es-AR"/>
-        </w:rPr>
-        <w:t>AntD</w:t>
-      </w:r>
-      <w:proofErr w:type="spellEnd"/>
-      <w:r>
-        <w:rPr>
-          <w:sz w:val="24"/>
-          <w:szCs w:val="24"/>
-          <w:lang w:val="es-AR"/>
-        </w:rPr>
-        <w:t xml:space="preserve">, </w:t>
-      </w:r>
-      <w:proofErr w:type="spellStart"/>
-      <w:r>
-        <w:rPr>
-          <w:sz w:val="24"/>
-          <w:szCs w:val="24"/>
-          <w:lang w:val="es-AR"/>
-        </w:rPr>
-        <w:t>MaterialUI</w:t>
-      </w:r>
-      <w:proofErr w:type="spellEnd"/>
-      <w:r>
-        <w:rPr>
-          <w:sz w:val="24"/>
-          <w:szCs w:val="24"/>
-          <w:lang w:val="es-AR"/>
-        </w:rPr>
-        <w:t>.</w:t>
+        <w:t>Librerías de UI: AntD, MaterialUI.</w:t>
       </w:r>
     </w:p>
     <w:p>
@@ -403,55 +267,7 @@
           <w:sz w:val="24"/>
           <w:szCs w:val="24"/>
         </w:rPr>
-        <w:t xml:space="preserve">Las </w:t>
-      </w:r>
-      <w:proofErr w:type="spellStart"/>
-      <w:r>
-        <w:rPr>
-          <w:sz w:val="24"/>
-          <w:szCs w:val="24"/>
-        </w:rPr>
-        <w:t>condiciones</w:t>
-      </w:r>
-      <w:proofErr w:type="spellEnd"/>
-      <w:r>
-        <w:rPr>
-          <w:sz w:val="24"/>
-          <w:szCs w:val="24"/>
-        </w:rPr>
-        <w:t xml:space="preserve"> </w:t>
-      </w:r>
-      <w:proofErr w:type="spellStart"/>
-      <w:r>
-        <w:rPr>
-          <w:sz w:val="24"/>
-          <w:szCs w:val="24"/>
-        </w:rPr>
-        <w:t>adicionales</w:t>
-      </w:r>
-      <w:proofErr w:type="spellEnd"/>
-      <w:r>
-        <w:rPr>
-          <w:sz w:val="24"/>
-          <w:szCs w:val="24"/>
-        </w:rPr>
-        <w:t xml:space="preserve"> (</w:t>
-      </w:r>
-      <w:proofErr w:type="spellStart"/>
-      <w:r>
-        <w:rPr>
-          <w:sz w:val="24"/>
-          <w:szCs w:val="24"/>
-        </w:rPr>
-        <w:t>obligatorias</w:t>
-      </w:r>
-      <w:proofErr w:type="spellEnd"/>
-      <w:r>
-        <w:rPr>
-          <w:sz w:val="24"/>
-          <w:szCs w:val="24"/>
-        </w:rPr>
-        <w:t>):</w:t>
+        <w:t>Las condiciones adicionales (obligatorias):</w:t>
       </w:r>
     </w:p>
     <w:p>
@@ -475,54 +291,8 @@
           <w:szCs w:val="24"/>
           <w:lang w:val="es-AR"/>
         </w:rPr>
-        <w:t xml:space="preserve">Seguridad con </w:t>
-      </w:r>
-      <w:proofErr w:type="spellStart"/>
-      <w:r>
-        <w:rPr>
-          <w:sz w:val="24"/>
-          <w:szCs w:val="24"/>
-          <w:lang w:val="es-AR"/>
-        </w:rPr>
-        <w:t>jwt</w:t>
-      </w:r>
-      <w:proofErr w:type="spellEnd"/>
-      <w:r>
-        <w:rPr>
-          <w:sz w:val="24"/>
-          <w:szCs w:val="24"/>
-          <w:lang w:val="es-AR"/>
-        </w:rPr>
-        <w:t xml:space="preserve"> utilizando </w:t>
-      </w:r>
-      <w:proofErr w:type="spellStart"/>
-      <w:r>
-        <w:rPr>
-          <w:sz w:val="24"/>
-          <w:szCs w:val="24"/>
-          <w:lang w:val="es-AR"/>
-        </w:rPr>
-        <w:t>localstorage</w:t>
-      </w:r>
-      <w:proofErr w:type="spellEnd"/>
-      <w:r>
-        <w:rPr>
-          <w:sz w:val="24"/>
-          <w:szCs w:val="24"/>
-          <w:lang w:val="es-AR"/>
-        </w:rPr>
-        <w:t>/cookie/</w:t>
-      </w:r>
-      <w:proofErr w:type="spellStart"/>
-      <w:r>
-        <w:rPr>
-          <w:sz w:val="24"/>
-          <w:szCs w:val="24"/>
-          <w:lang w:val="es-AR"/>
-        </w:rPr>
-        <w:t>session</w:t>
-      </w:r>
-      <w:proofErr w:type="spellEnd"/>
+        <w:t>Seguridad con jwt utilizando localstorage/cookie/session</w:t>
+      </w:r>
     </w:p>
     <w:p>
       <w:pPr>
@@ -545,25 +315,7 @@
           <w:szCs w:val="24"/>
           <w:lang w:val="es-AR"/>
         </w:rPr>
-        <w:t xml:space="preserve">Mínimo de DOS role que se </w:t>
-      </w:r>
-      <w:proofErr w:type="spellStart"/>
-      <w:r>
-        <w:rPr>
-          <w:sz w:val="24"/>
-          <w:szCs w:val="24"/>
-          <w:lang w:val="es-AR"/>
-        </w:rPr>
-        <w:t>loguean</w:t>
-      </w:r>
-      <w:proofErr w:type="spellEnd"/>
-      <w:r>
-        <w:rPr>
-          <w:sz w:val="24"/>
-          <w:szCs w:val="24"/>
-          <w:lang w:val="es-AR"/>
-        </w:rPr>
-        <w:t xml:space="preserve"> en el sistema</w:t>
+        <w:t>Mínimo de DOS role que se loguean en el sistema</w:t>
       </w:r>
     </w:p>
     <w:p>
@@ -604,47 +356,13 @@
           <w:szCs w:val="24"/>
         </w:rPr>
       </w:pPr>
-      <w:proofErr w:type="spellStart"/>
-      <w:r>
-        <w:rPr>
-          <w:sz w:val="24"/>
-          <w:szCs w:val="24"/>
-        </w:rPr>
-        <w:t>Relaciones</w:t>
-      </w:r>
-      <w:proofErr w:type="spellEnd"/>
-      <w:r>
-        <w:rPr>
-          <w:sz w:val="24"/>
-          <w:szCs w:val="24"/>
-        </w:rPr>
-        <w:t xml:space="preserve"> entre </w:t>
-      </w:r>
-      <w:proofErr w:type="spellStart"/>
-      <w:r>
-        <w:rPr>
-          <w:sz w:val="24"/>
-          <w:szCs w:val="24"/>
-        </w:rPr>
-        <w:t>distintas</w:t>
-      </w:r>
-      <w:proofErr w:type="spellEnd"/>
-      <w:r>
-        <w:rPr>
-          <w:sz w:val="24"/>
-          <w:szCs w:val="24"/>
-        </w:rPr>
-        <w:t xml:space="preserve"> </w:t>
-      </w:r>
-      <w:proofErr w:type="spellStart"/>
-      <w:r>
-        <w:rPr>
-          <w:sz w:val="24"/>
-          <w:szCs w:val="24"/>
-        </w:rPr>
-        <w:t>entidades</w:t>
-      </w:r>
-      <w:proofErr w:type="spellEnd"/>
+      <w:r>
+        <w:rPr>
+          <w:sz w:val="24"/>
+          <w:szCs w:val="24"/>
+        </w:rPr>
+        <w:t>Relaciones entre distintas entidades</w:t>
+      </w:r>
     </w:p>
     <w:p>
       <w:pPr>
@@ -661,23 +379,13 @@
           <w:lang w:val="es-AR"/>
         </w:rPr>
       </w:pPr>
-      <w:proofErr w:type="spellStart"/>
-      <w:r>
-        <w:rPr>
-          <w:sz w:val="24"/>
-          <w:szCs w:val="24"/>
-          <w:lang w:val="es-AR"/>
-        </w:rPr>
-        <w:t>Logueo</w:t>
-      </w:r>
-      <w:proofErr w:type="spellEnd"/>
-      <w:r>
-        <w:rPr>
-          <w:sz w:val="24"/>
-          <w:szCs w:val="24"/>
-          <w:lang w:val="es-AR"/>
-        </w:rPr>
-        <w:t xml:space="preserve"> de errores</w:t>
+      <w:r>
+        <w:rPr>
+          <w:sz w:val="24"/>
+          <w:szCs w:val="24"/>
+          <w:lang w:val="es-AR"/>
+        </w:rPr>
+        <w:t>Logueo de errores</w:t>
       </w:r>
       <w:r>
         <w:rPr>
@@ -726,25 +434,7 @@
           <w:szCs w:val="24"/>
           <w:lang w:val="es-AR"/>
         </w:rPr>
-        <w:t>Valores cargados en variables de entorno (</w:t>
-      </w:r>
-      <w:proofErr w:type="spellStart"/>
-      <w:r>
-        <w:rPr>
-          <w:sz w:val="24"/>
-          <w:szCs w:val="24"/>
-          <w:lang w:val="es-AR"/>
-        </w:rPr>
-        <w:t>front</w:t>
-      </w:r>
-      <w:proofErr w:type="spellEnd"/>
-      <w:r>
-        <w:rPr>
-          <w:sz w:val="24"/>
-          <w:szCs w:val="24"/>
-          <w:lang w:val="es-AR"/>
-        </w:rPr>
-        <w:t xml:space="preserve"> y back)</w:t>
+        <w:t>Valores cargados en variables de entorno (front y back)</w:t>
       </w:r>
     </w:p>
     <w:p>
@@ -768,25 +458,7 @@
           <w:szCs w:val="24"/>
           <w:lang w:val="es-AR"/>
         </w:rPr>
-        <w:t>Mínimo de 5 páginas con ruteo (</w:t>
-      </w:r>
-      <w:proofErr w:type="spellStart"/>
-      <w:r>
-        <w:rPr>
-          <w:sz w:val="24"/>
-          <w:szCs w:val="24"/>
-          <w:lang w:val="es-AR"/>
-        </w:rPr>
-        <w:t>front</w:t>
-      </w:r>
-      <w:proofErr w:type="spellEnd"/>
-      <w:r>
-        <w:rPr>
-          <w:sz w:val="24"/>
-          <w:szCs w:val="24"/>
-          <w:lang w:val="es-AR"/>
-        </w:rPr>
-        <w:t>)</w:t>
+        <w:t>Mínimo de 5 páginas con ruteo (front)</w:t>
       </w:r>
     </w:p>
     <w:p>
@@ -803,37 +475,12 @@
           <w:szCs w:val="24"/>
         </w:rPr>
       </w:pPr>
-      <w:proofErr w:type="spellStart"/>
-      <w:r>
-        <w:rPr>
-          <w:sz w:val="24"/>
-          <w:szCs w:val="24"/>
-        </w:rPr>
-        <w:t>Mínimo</w:t>
-      </w:r>
-      <w:proofErr w:type="spellEnd"/>
-      <w:r>
-        <w:rPr>
-          <w:sz w:val="24"/>
-          <w:szCs w:val="24"/>
-        </w:rPr>
-        <w:t xml:space="preserve"> de 4 </w:t>
-      </w:r>
-      <w:proofErr w:type="spellStart"/>
-      <w:r>
-        <w:rPr>
-          <w:sz w:val="24"/>
-          <w:szCs w:val="24"/>
-        </w:rPr>
-        <w:t>entidades</w:t>
-      </w:r>
-      <w:proofErr w:type="spellEnd"/>
-      <w:r>
-        <w:rPr>
-          <w:sz w:val="24"/>
-          <w:szCs w:val="24"/>
-        </w:rPr>
-        <w:t xml:space="preserve"> (back)</w:t>
+      <w:r>
+        <w:rPr>
+          <w:sz w:val="24"/>
+          <w:szCs w:val="24"/>
+        </w:rPr>
+        <w:t>Mínimo de 4 entidades (back)</w:t>
       </w:r>
     </w:p>
     <w:p>
@@ -857,25 +504,7 @@
           <w:szCs w:val="24"/>
           <w:lang w:val="es-AR"/>
         </w:rPr>
-        <w:t xml:space="preserve">(opcional) Utilización de un </w:t>
-      </w:r>
-      <w:proofErr w:type="spellStart"/>
-      <w:r>
-        <w:rPr>
-          <w:sz w:val="24"/>
-          <w:szCs w:val="24"/>
-          <w:lang w:val="es-AR"/>
-        </w:rPr>
-        <w:t>bucket</w:t>
-      </w:r>
-      <w:proofErr w:type="spellEnd"/>
-      <w:r>
-        <w:rPr>
-          <w:sz w:val="24"/>
-          <w:szCs w:val="24"/>
-          <w:lang w:val="es-AR"/>
-        </w:rPr>
-        <w:t xml:space="preserve"> (AWS S3)</w:t>
+        <w:t>(opcional) Utilización de un bucket (AWS S3)</w:t>
       </w:r>
       <w:r>
         <w:rPr>
@@ -924,43 +553,7 @@
           <w:szCs w:val="24"/>
           <w:lang w:val="es-AR"/>
         </w:rPr>
-        <w:t xml:space="preserve">(opcional) </w:t>
-      </w:r>
-      <w:proofErr w:type="spellStart"/>
-      <w:r>
-        <w:rPr>
-          <w:sz w:val="24"/>
-          <w:szCs w:val="24"/>
-          <w:lang w:val="es-AR"/>
-        </w:rPr>
-        <w:t>Deployado</w:t>
-      </w:r>
-      <w:proofErr w:type="spellEnd"/>
-      <w:r>
-        <w:rPr>
-          <w:sz w:val="24"/>
-          <w:szCs w:val="24"/>
-          <w:lang w:val="es-AR"/>
-        </w:rPr>
-        <w:t xml:space="preserve"> en la nube (render, </w:t>
-      </w:r>
-      <w:proofErr w:type="spellStart"/>
-      <w:r>
-        <w:rPr>
-          <w:sz w:val="24"/>
-          <w:szCs w:val="24"/>
-          <w:lang w:val="es-AR"/>
-        </w:rPr>
-        <w:t>heroku</w:t>
-      </w:r>
-      <w:proofErr w:type="spellEnd"/>
-      <w:r>
-        <w:rPr>
-          <w:sz w:val="24"/>
-          <w:szCs w:val="24"/>
-          <w:lang w:val="es-AR"/>
-        </w:rPr>
-        <w:t>, AWS)</w:t>
+        <w:t>(opcional) Deployado en la nube (render, heroku, AWS)</w:t>
       </w:r>
       <w:r>
         <w:rPr>
@@ -970,7 +563,6 @@
         </w:rPr>
         <w:t xml:space="preserve"> (</w:t>
       </w:r>
-      <w:proofErr w:type="gramStart"/>
       <w:r>
         <w:rPr>
           <w:color w:val="EE0000"/>
@@ -980,7 +572,6 @@
         </w:rPr>
         <w:t>que es esto]?</w:t>
       </w:r>
-      <w:proofErr w:type="gramEnd"/>
       <w:r>
         <w:rPr>
           <w:sz w:val="24"/>
@@ -1032,28 +623,10 @@
       </w:pPr>
       <w:bookmarkStart w:id="2" w:name="_heading=h.1fob9te" w:colFirst="0" w:colLast="0"/>
       <w:bookmarkEnd w:id="2"/>
-      <w:proofErr w:type="spellStart"/>
       <w:r>
         <w:lastRenderedPageBreak/>
-        <w:t>Condiciones</w:t>
-      </w:r>
-      <w:proofErr w:type="spellEnd"/>
-      <w:r>
-        <w:t xml:space="preserve"> </w:t>
-      </w:r>
-      <w:proofErr w:type="spellStart"/>
-      <w:r>
-        <w:t>generales</w:t>
-      </w:r>
-      <w:proofErr w:type="spellEnd"/>
-      <w:r>
-        <w:t xml:space="preserve"> de </w:t>
-      </w:r>
-      <w:proofErr w:type="spellStart"/>
-      <w:r>
-        <w:t>aprobación</w:t>
-      </w:r>
-      <w:proofErr w:type="spellEnd"/>
+        <w:t>Condiciones generales de aprobación</w:t>
+      </w:r>
     </w:p>
     <w:p>
       <w:pPr>
@@ -1085,25 +658,7 @@
           <w:szCs w:val="24"/>
           <w:lang w:val="es-AR"/>
         </w:rPr>
-        <w:t xml:space="preserve">El trabajo debe funcionar correctamente, </w:t>
-      </w:r>
-      <w:proofErr w:type="gramStart"/>
-      <w:r>
-        <w:rPr>
-          <w:sz w:val="24"/>
-          <w:szCs w:val="24"/>
-          <w:lang w:val="es-AR"/>
-        </w:rPr>
-        <w:t>de acuerdo a</w:t>
-      </w:r>
-      <w:proofErr w:type="gramEnd"/>
-      <w:r>
-        <w:rPr>
-          <w:sz w:val="24"/>
-          <w:szCs w:val="24"/>
-          <w:lang w:val="es-AR"/>
-        </w:rPr>
-        <w:t xml:space="preserve"> todas las especificaciones solicitadas. Un trabajo que no contemple o implemente algunas de las funcionalidades descritas no podrá ser aprobado.</w:t>
+        <w:t>El trabajo debe funcionar correctamente, de acuerdo a todas las especificaciones solicitadas. Un trabajo que no contemple o implemente algunas de las funcionalidades descritas no podrá ser aprobado.</w:t>
       </w:r>
     </w:p>
     <w:p>
@@ -1123,23 +678,13 @@
           <w:lang w:val="es-AR"/>
         </w:rPr>
       </w:pPr>
-      <w:proofErr w:type="gramStart"/>
-      <w:r>
-        <w:rPr>
-          <w:sz w:val="24"/>
-          <w:szCs w:val="24"/>
-          <w:lang w:val="es-AR"/>
-        </w:rPr>
-        <w:t>Documentación a incluir</w:t>
-      </w:r>
-      <w:proofErr w:type="gramEnd"/>
-      <w:r>
-        <w:rPr>
-          <w:sz w:val="24"/>
-          <w:szCs w:val="24"/>
-          <w:lang w:val="es-AR"/>
-        </w:rPr>
-        <w:t xml:space="preserve"> para la entrega: Repositorio de código online publicado para su revisión.</w:t>
+      <w:r>
+        <w:rPr>
+          <w:sz w:val="24"/>
+          <w:szCs w:val="24"/>
+          <w:lang w:val="es-AR"/>
+        </w:rPr>
+        <w:t>Documentación a incluir para la entrega: Repositorio de código online publicado para su revisión.</w:t>
       </w:r>
     </w:p>
     <w:p>
@@ -1249,78 +794,24 @@
           <w:szCs w:val="24"/>
           <w:lang w:val="es-AR"/>
         </w:rPr>
-        <w:t xml:space="preserve">En </w:t>
-      </w:r>
-      <w:proofErr w:type="gramStart"/>
-      <w:r>
-        <w:rPr>
-          <w:sz w:val="24"/>
-          <w:szCs w:val="24"/>
-          <w:lang w:val="es-AR"/>
-        </w:rPr>
-        <w:t>un instancia</w:t>
-      </w:r>
-      <w:proofErr w:type="gramEnd"/>
-      <w:r>
-        <w:rPr>
-          <w:sz w:val="24"/>
-          <w:szCs w:val="24"/>
-          <w:lang w:val="es-AR"/>
-        </w:rPr>
-        <w:t xml:space="preserve"> de examen oral, se deberá exponer la defensa de lo realizado en dicho proyecto.</w:t>
-      </w:r>
-    </w:p>
-    <w:p>
-      <w:pPr>
-        <w:rPr>
-          <w:sz w:val="24"/>
-          <w:szCs w:val="24"/>
-          <w:lang w:val="es-AR"/>
-        </w:rPr>
-      </w:pPr>
-      <w:r>
-        <w:rPr>
-          <w:sz w:val="24"/>
-          <w:szCs w:val="24"/>
-          <w:lang w:val="es-AR"/>
-        </w:rPr>
-        <w:t xml:space="preserve">El </w:t>
-      </w:r>
-      <w:proofErr w:type="gramStart"/>
-      <w:r>
-        <w:rPr>
-          <w:sz w:val="24"/>
-          <w:szCs w:val="24"/>
-          <w:lang w:val="es-AR"/>
-        </w:rPr>
-        <w:t>link</w:t>
-      </w:r>
-      <w:proofErr w:type="gramEnd"/>
-      <w:r>
-        <w:rPr>
-          <w:sz w:val="24"/>
-          <w:szCs w:val="24"/>
-          <w:lang w:val="es-AR"/>
-        </w:rPr>
-        <w:t xml:space="preserve"> al repositorio en el cual se encontrará el </w:t>
-      </w:r>
-      <w:proofErr w:type="gramStart"/>
-      <w:r>
-        <w:rPr>
-          <w:sz w:val="24"/>
-          <w:szCs w:val="24"/>
-          <w:lang w:val="es-AR"/>
-        </w:rPr>
-        <w:t>proyecto,</w:t>
-      </w:r>
-      <w:proofErr w:type="gramEnd"/>
-      <w:r>
-        <w:rPr>
-          <w:sz w:val="24"/>
-          <w:szCs w:val="24"/>
-          <w:lang w:val="es-AR"/>
-        </w:rPr>
-        <w:t xml:space="preserve"> deberá ser informado para su revisión una semana antes, como mínimo, de la exposición final en fecha de examen.</w:t>
+        <w:t>En un instancia de examen oral, se deberá exponer la defensa de lo realizado en dicho proyecto.</w:t>
+      </w:r>
+    </w:p>
+    <w:p>
+      <w:pPr>
+        <w:rPr>
+          <w:sz w:val="24"/>
+          <w:szCs w:val="24"/>
+          <w:lang w:val="es-AR"/>
+        </w:rPr>
+      </w:pPr>
+      <w:r>
+        <w:rPr>
+          <w:sz w:val="24"/>
+          <w:szCs w:val="24"/>
+          <w:lang w:val="es-AR"/>
+        </w:rPr>
+        <w:t>El link al repositorio en el cual se encontrará el proyecto, deberá ser informado para su revisión una semana antes, como mínimo, de la exposición final en fecha de examen.</w:t>
       </w:r>
     </w:p>
     <w:p>
@@ -1363,13 +854,8 @@
       </w:pPr>
       <w:bookmarkStart w:id="4" w:name="_heading=h.2et92p0" w:colFirst="0" w:colLast="0"/>
       <w:bookmarkEnd w:id="4"/>
-      <w:proofErr w:type="spellStart"/>
-      <w:r>
-        <w:t>Descripción</w:t>
-      </w:r>
-      <w:proofErr w:type="spellEnd"/>
-      <w:r>
-        <w:t xml:space="preserve"> general</w:t>
+      <w:r>
+        <w:t>Descripción general</w:t>
       </w:r>
     </w:p>
     <w:p>
@@ -1402,23 +888,13 @@
           <w:lang w:val="es-AR"/>
         </w:rPr>
       </w:pPr>
-      <w:proofErr w:type="gramStart"/>
-      <w:r>
-        <w:rPr>
-          <w:sz w:val="24"/>
-          <w:szCs w:val="24"/>
-          <w:lang w:val="es-AR"/>
-        </w:rPr>
-        <w:t>El sistema a implementar</w:t>
-      </w:r>
-      <w:proofErr w:type="gramEnd"/>
-      <w:r>
-        <w:rPr>
-          <w:sz w:val="24"/>
-          <w:szCs w:val="24"/>
-          <w:lang w:val="es-AR"/>
-        </w:rPr>
-        <w:t xml:space="preserve"> debe contemplar las funcionalidades:</w:t>
+      <w:r>
+        <w:rPr>
+          <w:sz w:val="24"/>
+          <w:szCs w:val="24"/>
+          <w:lang w:val="es-AR"/>
+        </w:rPr>
+        <w:t>El sistema a implementar debe contemplar las funcionalidades:</w:t>
       </w:r>
     </w:p>
     <w:p>
@@ -1530,6 +1006,59 @@
           <w:lang w:val="es-AR"/>
         </w:rPr>
         <w:t>Los organizadores pueden descargar un listado de inscriptos en cada evento.</w:t>
+      </w:r>
+      <w:r>
+        <w:rPr>
+          <w:sz w:val="24"/>
+          <w:szCs w:val="24"/>
+          <w:lang w:val="es-AR"/>
+        </w:rPr>
+        <w:br/>
+      </w:r>
+    </w:p>
+    <w:p>
+      <w:pPr>
+        <w:spacing w:after="240"/>
+        <w:rPr>
+          <w:sz w:val="24"/>
+          <w:szCs w:val="24"/>
+          <w:lang w:val="es-AR"/>
+        </w:rPr>
+      </w:pPr>
+      <w:r>
+        <w:rPr>
+          <w:sz w:val="24"/>
+          <w:szCs w:val="24"/>
+          <w:lang w:val="es-AR"/>
+        </w:rPr>
+        <w:t>Reorganizar la vista de front end menos espacios en blancos no perder pantalla</w:t>
+      </w:r>
+      <w:r>
+        <w:rPr>
+          <w:sz w:val="24"/>
+          <w:szCs w:val="24"/>
+          <w:lang w:val="es-AR"/>
+        </w:rPr>
+        <w:br/>
+        <w:t>notificaciones y mensajes para el participantes {from  to messaje fecha y estado}</w:t>
+      </w:r>
+    </w:p>
+    <w:p>
+      <w:pPr>
+        <w:spacing w:after="240"/>
+        <w:rPr>
+          <w:sz w:val="24"/>
+          <w:szCs w:val="24"/>
+          <w:lang w:val="es-AR"/>
+        </w:rPr>
+      </w:pPr>
+      <w:r>
+        <w:rPr>
+          <w:sz w:val="24"/>
+          <w:szCs w:val="24"/>
+          <w:lang w:val="es-AR"/>
+        </w:rPr>
+        <w:t>Valoración de eventos.</w:t>
       </w:r>
       <w:r>
         <w:rPr>
@@ -1743,18 +1272,8 @@
         <w:lang w:val="es-AR"/>
       </w:rPr>
       <w:tab/>
-      <w:t xml:space="preserve">Prof. Gaston A. </w:t>
+      <w:t>Prof. Gaston A. Larriera</w:t>
     </w:r>
-    <w:proofErr w:type="spellStart"/>
-    <w:r>
-      <w:rPr>
-        <w:i/>
-        <w:color w:val="CCCCCC"/>
-        <w:lang w:val="es-AR"/>
-      </w:rPr>
-      <w:t>Larriera</w:t>
-    </w:r>
-    <w:proofErr w:type="spellEnd"/>
   </w:p>
   <w:p>
     <w:r>
@@ -1799,7 +1318,7 @@
             </wp:inline>
           </w:drawing>
         </mc:Choice>
-        <mc:Fallback xmlns:cr="http://schemas.microsoft.com/office/comments/2020/reactions" xmlns="http://schemas.microsoft.com/office/tasks/2019/documenttasks" xmlns:dgm="http://schemas.openxmlformats.org/drawingml/2006/diagram" xmlns:lc="http://schemas.openxmlformats.org/drawingml/2006/lockedCanvas" xmlns:c="http://schemas.openxmlformats.org/drawingml/2006/chart" xmlns:pic="http://schemas.openxmlformats.org/drawingml/2006/picture" xmlns:a="http://schemas.openxmlformats.org/drawingml/2006/main" xmlns:sl="http://schemas.openxmlformats.org/schemaLibrary/2006/main">
+        <mc:Fallback xmlns:sl="http://schemas.openxmlformats.org/schemaLibrary/2006/main" xmlns:a="http://schemas.openxmlformats.org/drawingml/2006/main" xmlns:pic="http://schemas.openxmlformats.org/drawingml/2006/picture" xmlns:c="http://schemas.openxmlformats.org/drawingml/2006/chart" xmlns:lc="http://schemas.openxmlformats.org/drawingml/2006/lockedCanvas" xmlns:dgm="http://schemas.openxmlformats.org/drawingml/2006/diagram" xmlns="http://schemas.microsoft.com/office/tasks/2019/documenttasks" xmlns:cr="http://schemas.microsoft.com/office/comments/2020/reactions">
           <w:drawing>
             <wp:inline distB="114300" distT="114300" distL="114300" distR="114300">
               <wp:extent cx="5372100" cy="37104"/>
@@ -1849,21 +1368,12 @@
         <w:color w:val="CCCCCC"/>
       </w:rPr>
     </w:pPr>
-    <w:proofErr w:type="spellStart"/>
     <w:r>
       <w:rPr>
         <w:i/>
         <w:color w:val="CCCCCC"/>
       </w:rPr>
-      <w:t>Programación</w:t>
-    </w:r>
-    <w:proofErr w:type="spellEnd"/>
-    <w:r>
-      <w:rPr>
-        <w:i/>
-        <w:color w:val="CCCCCC"/>
-      </w:rPr>
-      <w:t xml:space="preserve"> III - 2022</w:t>
+      <w:t>Programación III - 2022</w:t>
     </w:r>
     <w:r>
       <w:rPr>
@@ -1952,7 +1462,7 @@
             </wp:inline>
           </w:drawing>
         </mc:Choice>
-        <mc:Fallback xmlns:cr="http://schemas.microsoft.com/office/comments/2020/reactions" xmlns="http://schemas.microsoft.com/office/tasks/2019/documenttasks" xmlns:dgm="http://schemas.openxmlformats.org/drawingml/2006/diagram" xmlns:lc="http://schemas.openxmlformats.org/drawingml/2006/lockedCanvas" xmlns:c="http://schemas.openxmlformats.org/drawingml/2006/chart" xmlns:pic="http://schemas.openxmlformats.org/drawingml/2006/picture" xmlns:a="http://schemas.openxmlformats.org/drawingml/2006/main" xmlns:sl="http://schemas.openxmlformats.org/schemaLibrary/2006/main">
+        <mc:Fallback xmlns:sl="http://schemas.openxmlformats.org/schemaLibrary/2006/main" xmlns:a="http://schemas.openxmlformats.org/drawingml/2006/main" xmlns:pic="http://schemas.openxmlformats.org/drawingml/2006/picture" xmlns:c="http://schemas.openxmlformats.org/drawingml/2006/chart" xmlns:lc="http://schemas.openxmlformats.org/drawingml/2006/lockedCanvas" xmlns:dgm="http://schemas.openxmlformats.org/drawingml/2006/diagram" xmlns="http://schemas.microsoft.com/office/tasks/2019/documenttasks" xmlns:cr="http://schemas.microsoft.com/office/comments/2020/reactions">
           <w:drawing>
             <wp:inline distB="114300" distT="114300" distL="114300" distR="114300">
               <wp:extent cx="5372100" cy="37104"/>

</xml_diff>